<commit_message>
docs(vircle-chat): gateway scope; push belongs to the gateway, not Halo
Co-Authored-By: Claude Sonnet 5.5 <noreply@anthropic.com>
</commit_message>
<xml_diff>
--- a/docs/vircle-chat-contract.docx
+++ b/docs/vircle-chat-contract.docx
@@ -146,7 +146,32 @@
               <w:pStyle w:val="Compact"/>
             </w:pPr>
             <w:r>
-              <w:t xml:space="preserve">No; the Vircle developers will add one</w:t>
+              <w:t xml:space="preserve">No. </w:t>
+            </w:r>
+            <w:r>
+              <w:rPr>
+                <w:b/>
+                <w:bCs/>
+              </w:rPr>
+              <w:t xml:space="preserve">We build it</w:t>
+            </w:r>
+            <w:r>
+              <w:t xml:space="preserve"> </w:t>
+            </w:r>
+            <w:r>
+              <w:t xml:space="preserve">(scope:</w:t>
+            </w:r>
+            <w:r>
+              <w:t xml:space="preserve"> </w:t>
+            </w:r>
+            <w:r>
+              <w:rPr>
+                <w:rStyle w:val="VerbatimChar"/>
+              </w:rPr>
+              <w:t xml:space="preserve">docs/vircle-chat-gateway-scope.md</w:t>
+            </w:r>
+            <w:r>
+              <w:t xml:space="preserve">); the owner’s developer then builds the app chat screen</w:t>
             </w:r>
           </w:p>
         </w:tc>
@@ -157,7 +182,7 @@
               <w:pStyle w:val="Compact"/>
             </w:pPr>
             <w:r>
-              <w:t xml:space="preserve">The gateway is new work, built against this contract</w:t>
+              <w:t xml:space="preserve">The gateway is built against this contract, with a simulator to test chats before the app exists</w:t>
             </w:r>
           </w:p>
         </w:tc>
@@ -229,7 +254,7 @@
               <w:t xml:space="preserve">phone number or email</w:t>
             </w:r>
             <w:r>
-              <w:t xml:space="preserve">; it finds the user and pushes. Details to follow</w:t>
+              <w:t xml:space="preserve">; it finds the user and pushes. Details to follow. The gateway decides when to push; Halo never does</w:t>
             </w:r>
           </w:p>
         </w:tc>
@@ -240,7 +265,7 @@
               <w:pStyle w:val="Compact"/>
             </w:pPr>
             <w:r>
-              <w:t xml:space="preserve">Halo (or the gateway) can raise an alert without holding any push credentials. See section 7</w:t>
+              <w:t xml:space="preserve">The gateway calls it. Halo holds no push credentials and has no push logic. See section 7</w:t>
             </w:r>
           </w:p>
         </w:tc>
@@ -3136,40 +3161,10 @@
         <w:t xml:space="preserve">“sent”</w:t>
       </w:r>
       <w:r>
-        <w:t xml:space="preserve">; section 7 describes what it does</w:t>
-      </w:r>
-      <w:r>
-        <w:t xml:space="preserve"> </w:t>
-      </w:r>
-      <w:r>
-        <w:t xml:space="preserve">with</w:t>
-      </w:r>
-      <w:r>
-        <w:t xml:space="preserve"> </w:t>
-      </w:r>
-      <w:r>
-        <w:rPr>
-          <w:rStyle w:val="VerbatimChar"/>
-        </w:rPr>
-        <w:t xml:space="preserve">queued</w:t>
-      </w:r>
-      <w:r>
-        <w:t xml:space="preserve"> </w:t>
-      </w:r>
-      <w:r>
-        <w:t xml:space="preserve">and</w:t>
-      </w:r>
-      <w:r>
-        <w:t xml:space="preserve"> </w:t>
-      </w:r>
-      <w:r>
-        <w:rPr>
-          <w:rStyle w:val="VerbatimChar"/>
-        </w:rPr>
-        <w:t xml:space="preserve">no_device</w:t>
-      </w:r>
-      <w:r>
-        <w:t xml:space="preserve">.</w:t>
+        <w:t xml:space="preserve"> </w:t>
+      </w:r>
+      <w:r>
+        <w:t xml:space="preserve">and does nothing more (section 7).</w:t>
       </w:r>
     </w:p>
     <w:p>
@@ -3883,73 +3878,7 @@
         <w:pStyle w:val="FirstParagraph"/>
       </w:pPr>
       <w:r>
-        <w:t xml:space="preserve">The gateway owns the socket-or-push decision, so for</w:t>
-      </w:r>
-      <w:r>
-        <w:t xml:space="preserve"> </w:t>
-      </w:r>
-      <w:r>
-        <w:rPr>
-          <w:rStyle w:val="VerbatimChar"/>
-        </w:rPr>
-        <w:t xml:space="preserve">delivery: "socket"</w:t>
-      </w:r>
-      <w:r>
-        <w:t xml:space="preserve"> </w:t>
-      </w:r>
-      <w:r>
-        <w:t xml:space="preserve">or</w:t>
-      </w:r>
-      <w:r>
-        <w:t xml:space="preserve"> </w:t>
-      </w:r>
-      <w:r>
-        <w:rPr>
-          <w:rStyle w:val="VerbatimChar"/>
-        </w:rPr>
-        <w:t xml:space="preserve">"push"</w:t>
-      </w:r>
-      <w:r>
-        <w:t xml:space="preserve"> </w:t>
-      </w:r>
-      <w:r>
-        <w:t xml:space="preserve">Halo does nothing more.</w:t>
-      </w:r>
-      <w:r>
-        <w:t xml:space="preserve"> </w:t>
-      </w:r>
-      <w:r>
-        <w:t xml:space="preserve">For</w:t>
-      </w:r>
-      <w:r>
-        <w:t xml:space="preserve"> </w:t>
-      </w:r>
-      <w:r>
-        <w:rPr>
-          <w:rStyle w:val="VerbatimChar"/>
-        </w:rPr>
-        <w:t xml:space="preserve">delivery: "queued"</w:t>
-      </w:r>
-      <w:r>
-        <w:t xml:space="preserve"> </w:t>
-      </w:r>
-      <w:r>
-        <w:t xml:space="preserve">or</w:t>
-      </w:r>
-      <w:r>
-        <w:t xml:space="preserve"> </w:t>
-      </w:r>
-      <w:r>
-        <w:rPr>
-          <w:rStyle w:val="VerbatimChar"/>
-        </w:rPr>
-        <w:t xml:space="preserve">"no_device"</w:t>
-      </w:r>
-      <w:r>
-        <w:t xml:space="preserve"> </w:t>
-      </w:r>
-      <w:r>
-        <w:t xml:space="preserve">the user may not know a reply is waiting. If the workspace turns on</w:t>
+        <w:t xml:space="preserve">Decided by the owner, 3 Oct 2026:</w:t>
       </w:r>
       <w:r>
         <w:t xml:space="preserve"> </w:t>
@@ -3959,43 +3888,185 @@
           <w:b/>
           <w:bCs/>
         </w:rPr>
-        <w:t xml:space="preserve">Push alerts from Halo</w:t>
-      </w:r>
-      <w:r>
-        <w:t xml:space="preserve"> </w:t>
-      </w:r>
-      <w:r>
-        <w:t xml:space="preserve">and the push API is configured, Halo asks the Vircle push API to alert the user</w:t>
-      </w:r>
-      <w:r>
-        <w:t xml:space="preserve"> </w:t>
-      </w:r>
-      <w:r>
-        <w:t xml:space="preserve">(recipient: the phone number, else the email, on the contact), generic text with a deep link, at most once per</w:t>
-      </w:r>
-      <w:r>
-        <w:t xml:space="preserve"> </w:t>
-      </w:r>
-      <w:r>
-        <w:t xml:space="preserve">conversation per away period (the rule the web widget’s email already follows). The push API’s details are</w:t>
-      </w:r>
-      <w:r>
-        <w:t xml:space="preserve"> </w:t>
-      </w:r>
-      <w:r>
-        <w:t xml:space="preserve">still to come (endpoint, authentication, payload, error contract); the hook is</w:t>
-      </w:r>
-      <w:r>
-        <w:t xml:space="preserve"> </w:t>
-      </w:r>
-      <w:r>
-        <w:rPr>
-          <w:rStyle w:val="VerbatimChar"/>
-        </w:rPr>
-        <w:t xml:space="preserve">src/lib/widget/notify-app-push.ts</w:t>
-      </w:r>
-      <w:r>
-        <w:t xml:space="preserve">. Until it exists the setting does nothing.</w:t>
+        <w:t xml:space="preserve">the gateway alone decides</w:t>
+      </w:r>
+      <w:r>
+        <w:t xml:space="preserve"> </w:t>
+      </w:r>
+      <w:r>
+        <w:t xml:space="preserve">between a socket and a push for each</w:t>
+      </w:r>
+      <w:r>
+        <w:t xml:space="preserve"> </w:t>
+      </w:r>
+      <w:r>
+        <w:t xml:space="preserve">message, and it raises the push itself through the Vircle push API (which takes a phone number or an</w:t>
+      </w:r>
+      <w:r>
+        <w:t xml:space="preserve"> </w:t>
+      </w:r>
+      <w:r>
+        <w:t xml:space="preserve">email and finds the user and device). Halo never sends a push and holds no push credentials.</w:t>
+      </w:r>
+    </w:p>
+    <w:p>
+      <w:pPr>
+        <w:pStyle w:val="BodyText"/>
+      </w:pPr>
+      <w:r>
+        <w:t xml:space="preserve">For Halo this means nothing more than the</w:t>
+      </w:r>
+      <w:r>
+        <w:t xml:space="preserve"> </w:t>
+      </w:r>
+      <w:r>
+        <w:rPr>
+          <w:rStyle w:val="VerbatimChar"/>
+        </w:rPr>
+        <w:t xml:space="preserve">delivery</w:t>
+      </w:r>
+      <w:r>
+        <w:t xml:space="preserve"> </w:t>
+      </w:r>
+      <w:r>
+        <w:t xml:space="preserve">value in section 4:</w:t>
+      </w:r>
+      <w:r>
+        <w:t xml:space="preserve"> </w:t>
+      </w:r>
+      <w:r>
+        <w:rPr>
+          <w:rStyle w:val="VerbatimChar"/>
+        </w:rPr>
+        <w:t xml:space="preserve">socket</w:t>
+      </w:r>
+      <w:r>
+        <w:t xml:space="preserve">,</w:t>
+      </w:r>
+      <w:r>
+        <w:t xml:space="preserve"> </w:t>
+      </w:r>
+      <w:r>
+        <w:rPr>
+          <w:rStyle w:val="VerbatimChar"/>
+        </w:rPr>
+        <w:t xml:space="preserve">push</w:t>
+      </w:r>
+      <w:r>
+        <w:t xml:space="preserve"> </w:t>
+      </w:r>
+      <w:r>
+        <w:t xml:space="preserve">or</w:t>
+      </w:r>
+      <w:r>
+        <w:t xml:space="preserve"> </w:t>
+      </w:r>
+      <w:r>
+        <w:rPr>
+          <w:rStyle w:val="VerbatimChar"/>
+        </w:rPr>
+        <w:t xml:space="preserve">queued</w:t>
+      </w:r>
+      <w:r>
+        <w:t xml:space="preserve"> </w:t>
+      </w:r>
+      <w:r>
+        <w:t xml:space="preserve">(the user could not be alerted yet; the message waits for their next connection) are all shown as</w:t>
+      </w:r>
+      <w:r>
+        <w:t xml:space="preserve"> </w:t>
+      </w:r>
+      <w:r>
+        <w:t xml:space="preserve">“sent”</w:t>
+      </w:r>
+      <w:r>
+        <w:t xml:space="preserve">,</w:t>
+      </w:r>
+      <w:r>
+        <w:t xml:space="preserve"> </w:t>
+      </w:r>
+      <w:r>
+        <w:t xml:space="preserve">and</w:t>
+      </w:r>
+      <w:r>
+        <w:t xml:space="preserve"> </w:t>
+      </w:r>
+      <w:r>
+        <w:rPr>
+          <w:rStyle w:val="VerbatimChar"/>
+        </w:rPr>
+        <w:t xml:space="preserve">delivered</w:t>
+      </w:r>
+      <w:r>
+        <w:t xml:space="preserve"> </w:t>
+      </w:r>
+      <w:r>
+        <w:t xml:space="preserve">/</w:t>
+      </w:r>
+      <w:r>
+        <w:t xml:space="preserve"> </w:t>
+      </w:r>
+      <w:r>
+        <w:rPr>
+          <w:rStyle w:val="VerbatimChar"/>
+        </w:rPr>
+        <w:t xml:space="preserve">read</w:t>
+      </w:r>
+      <w:r>
+        <w:t xml:space="preserve"> </w:t>
+      </w:r>
+      <w:r>
+        <w:t xml:space="preserve">follow as receipts when the app reports them. A user the gateway cannot reach at</w:t>
+      </w:r>
+      <w:r>
+        <w:t xml:space="preserve"> </w:t>
+      </w:r>
+      <w:r>
+        <w:t xml:space="preserve">all (</w:t>
+      </w:r>
+      <w:r>
+        <w:rPr>
+          <w:rStyle w:val="VerbatimChar"/>
+        </w:rPr>
+        <w:t xml:space="preserve">no_device</w:t>
+      </w:r>
+      <w:r>
+        <w:t xml:space="preserve">) is also</w:t>
+      </w:r>
+      <w:r>
+        <w:t xml:space="preserve"> </w:t>
+      </w:r>
+      <w:r>
+        <w:t xml:space="preserve">“sent”</w:t>
+      </w:r>
+      <w:r>
+        <w:t xml:space="preserve">; the agent sees no tick beyond that.</w:t>
+      </w:r>
+    </w:p>
+    <w:p>
+      <w:pPr>
+        <w:pStyle w:val="BodyText"/>
+      </w:pPr>
+      <w:r>
+        <w:t xml:space="preserve">The gateway needs the user’s phone and email to name the push recipient, which is why section 3.1 asks</w:t>
+      </w:r>
+      <w:r>
+        <w:t xml:space="preserve"> </w:t>
+      </w:r>
+      <w:r>
+        <w:t xml:space="preserve">for them on every event, and why the user’s session token (the gateway’s own, see</w:t>
+      </w:r>
+      <w:r>
+        <w:t xml:space="preserve"> </w:t>
+      </w:r>
+      <w:r>
+        <w:rPr>
+          <w:rStyle w:val="VerbatimChar"/>
+        </w:rPr>
+        <w:t xml:space="preserve">docs/vircle-chat-gateway-scope.md</w:t>
+      </w:r>
+      <w:r>
+        <w:t xml:space="preserve">) carries them.</w:t>
       </w:r>
     </w:p>
     <w:bookmarkEnd w:id="19"/>

</xml_diff>